<commit_message>
docs(ia): actualizar el informe H1 con los datos de tareas de hasta 4 h
Se actualizan la tabla de resultados, las dos gráficas y el texto (reducción del
error 35 %, F-11 casi igual que la estimación del usuario, 26.5 a 24.1 min con
subcategoría y fatiga). Se corrige la afirmación de que el agente híbrido
funciona desde la primera tarea: con menos de 10 tareas medidas no supera al
modelo de población (33.4 contra 31.0 min). Se aclara que la baja del error en
minutos se debe a la menor escala de las tareas.

Co-Authored-By: Claude Sonnet 5.5 <noreply@anthropic.com>
Claude-Session: https://claude.ai/code/session_015GbKTDAErY71kK5jRTGhDr
</commit_message>
<xml_diff>
--- a/KRONO-IA/resultados/KRONO-IA_Resultados_H1.docx
+++ b/KRONO-IA/resultados/KRONO-IA_Resultados_H1.docx
@@ -231,7 +231,7 @@
               <w:jc w:val="center"/>
             </w:pPr>
             <w:r>
-              <w:t xml:space="preserve">60.6 min</w:t>
+              <w:t xml:space="preserve">40.6 min</w:t>
             </w:r>
           </w:p>
         </w:tc>
@@ -319,7 +319,7 @@
                 <w:b/>
                 <w:bCs/>
               </w:rPr>
-              <w:t xml:space="preserve">70.7 min</w:t>
+              <w:t xml:space="preserve">39.6 min</w:t>
             </w:r>
           </w:p>
         </w:tc>
@@ -348,7 +348,7 @@
                 <w:b/>
                 <w:bCs/>
               </w:rPr>
-              <w:t xml:space="preserve">25 %</w:t>
+              <w:t xml:space="preserve">29 %</w:t>
             </w:r>
           </w:p>
         </w:tc>
@@ -403,7 +403,7 @@
               <w:jc w:val="center"/>
             </w:pPr>
             <w:r>
-              <w:t xml:space="preserve">43.0 min</w:t>
+              <w:t xml:space="preserve">27.8 min</w:t>
             </w:r>
           </w:p>
         </w:tc>
@@ -428,7 +428,7 @@
               <w:jc w:val="center"/>
             </w:pPr>
             <w:r>
-              <w:t xml:space="preserve">45 %</w:t>
+              <w:t xml:space="preserve">47 %</w:t>
             </w:r>
           </w:p>
         </w:tc>
@@ -491,7 +491,7 @@
                 <w:b/>
                 <w:bCs/>
               </w:rPr>
-              <w:t xml:space="preserve">40.3 min</w:t>
+              <w:t xml:space="preserve">26.5 min</w:t>
             </w:r>
           </w:p>
         </w:tc>
@@ -520,7 +520,7 @@
                 <w:b/>
                 <w:bCs/>
               </w:rPr>
-              <w:t xml:space="preserve">47 %</w:t>
+              <w:t xml:space="preserve">49 %</w:t>
             </w:r>
           </w:p>
         </w:tc>
@@ -575,7 +575,7 @@
               <w:jc w:val="center"/>
             </w:pPr>
             <w:r>
-              <w:t xml:space="preserve">37.5 min</w:t>
+              <w:t xml:space="preserve">24.1 min</w:t>
             </w:r>
           </w:p>
         </w:tc>
@@ -674,10 +674,10 @@
           <w:b/>
           <w:bCs/>
         </w:rPr>
-        <w:t xml:space="preserve">El agente híbrido reduce el error un 33 % frente a la estimación del usuario. </w:t>
-      </w:r>
-      <w:r>
-        <w:t xml:space="preserve">Combina un modelo entrenado con todos los usuarios y el sesgo personal que aprende de cada uno, tarea a tarea. Funciona desde la primera tarea de un usuario nuevo.</w:t>
+        <w:t xml:space="preserve">El agente híbrido reduce el error un 35 % frente a la estimación del usuario. </w:t>
+      </w:r>
+      <w:r>
+        <w:t xml:space="preserve">Combina un modelo entrenado con todos los usuarios y el sesgo personal que aprende de cada uno, tarea a tarea. Con menos de 10 tareas medidas todavía no supera al modelo de población (33.4 contra 31.0 min), porque aún está aprendiendo el sesgo del usuario; desde la tarea 11 sí lo supera (por ejemplo, 26.8 contra 30.2 min entre las tareas 21 y 40).</w:t>
       </w:r>
     </w:p>
     <w:p>
@@ -694,7 +694,7 @@
           <w:b/>
           <w:bCs/>
         </w:rPr>
-        <w:t xml:space="preserve">La regla que se programó para F-11 (promedio por categoría) es peor incluso que la estimación del usuario. </w:t>
+        <w:t xml:space="preserve">La regla que se programó para F-11 (promedio por categoría) queda casi igual que la estimación del usuario (39.6 contra 40.6 min) y muy por debajo del agente híbrido (26.5 min). </w:t>
       </w:r>
       <w:r>
         <w:t xml:space="preserve">Ignora el tamaño de cada tarea: una lectura corta y una larga reciben el mismo promedio. Conviene reemplazarla por el agente híbrido.</w:t>
@@ -737,7 +737,7 @@
         <w:t xml:space="preserve">Agregar subcategoría y fatiga a la app mejoraría el modelo, </w:t>
       </w:r>
       <w:r>
-        <w:t xml:space="preserve">pero solo un poco (de 40.3 a 37.5 min).</w:t>
+        <w:t xml:space="preserve">pero solo un poco (de 26.5 a 24.1 min).</w:t>
       </w:r>
     </w:p>
     <w:p>
@@ -799,7 +799,7 @@
         <w:spacing w:after="120"/>
       </w:pPr>
       <w:r>
-        <w:t xml:space="preserve">Estos datos son sintéticos: el modelo aprende la regla con la que SCRIPT.PY los generó. Eso valida el método, no el comportamiento real de los estudiantes. Para eso está la plantilla de datos piloto reales.</w:t>
+        <w:t xml:space="preserve">Estos datos son sintéticos: el modelo aprende la regla con la que SCRIPT.PY los generó. Eso valida el método, no el comportamiento real de los estudiantes. Para eso está la plantilla de datos piloto reales. Los datos se ajustaron para que ninguna tarea dure más de 4 horas (antes llegaban a 13); por eso el error en minutos es menor que en la versión anterior del informe. Esa bajada se debe a la menor escala de las tareas, no a un mejor modelo: para comparar versiones conviene mirar el error porcentual (cerca del 24 %) y el R² (0.68 en el agente híbrido completo).</w:t>
       </w:r>
     </w:p>
     <w:p>

</xml_diff>